<commit_message>
Remove Utah Highway Patrol and personal email from docs
</commit_message>
<xml_diff>
--- a/docs/MMMF_Facilitator_Certification_Agreement.docx
+++ b/docs/MMMF_Facilitator_Certification_Agreement.docx
@@ -163,7 +163,7 @@
                 <w:sz w:val="18"/>
                 <w:szCs w:val="18"/>
               </w:rPr>
-              <w:t xml:space="preserve">Utah Highway Patrol Sergeant  ·  MAT Candidate</w:t>
+              <w:t xml:space="preserve">Founder  ·  Curriculum Designer</w:t>
             </w:r>
           </w:p>
           <w:p>
@@ -177,7 +177,7 @@
                 <w:sz w:val="18"/>
                 <w:szCs w:val="18"/>
               </w:rPr>
-              <w:t xml:space="preserve">readyforreal.life  ·  mikeyterry44@gmail.com</w:t>
+              <w:t xml:space="preserve">readyforreal.life  ·  readyforreal.life44@gmail.com</w:t>
             </w:r>
           </w:p>
         </w:tc>
@@ -1953,7 +1953,7 @@
                 <w:sz w:val="20"/>
                 <w:szCs w:val="20"/>
               </w:rPr>
-              <w:t xml:space="preserve">This Agreement is a legally binding document. The Licensee is encouraged to retain a copy for their records. Questions regarding this Agreement should be directed to Michael R. Terry at mikeyterry44@gmail.com.</w:t>
+              <w:t xml:space="preserve">This Agreement is a legally binding document. The Licensee is encouraged to retain a copy for their records. Questions regarding this Agreement should be directed to Michael R. Terry at readyforreal.life44@gmail.com.</w:t>
             </w:r>
           </w:p>
         </w:tc>

</xml_diff>